<commit_message>
docs(sdd): embed Figure 1-1 architecture diagram (icon-based, mingrammer/diagrams)
Render container-view architecture with real service icons (Spring, React, Go,
PostgreSQL, Redis, RabbitMQ, Kong gateway, Consul/Eureka, Prometheus/Grafana/
Tempo, MinIO) and embed into SDD §1.1, replacing the placeholder.

Co-Authored-By: Claude Opus 4.8 <noreply@anthropic.com>
</commit_message>
<xml_diff>
--- a/docs/SDD_PCMS_v1.0.docx
+++ b/docs/SDD_PCMS_v1.0.docx
@@ -1309,17 +1309,59 @@
     <w:p>
       <w:pPr>
         <w:jc w:val="center"/>
+      </w:pPr>
+      <w:r>
+        <w:drawing>
+          <wp:inline distT="0" distB="0" distL="0" distR="0">
+            <wp:extent cx="5943600" cy="3913762"/>
+            <wp:effectExtent l="0" t="0" r="0" b="0"/>
+            <wp:docPr id="101" name="Figure 1-1 PCMS System Architecture"/>
+            <wp:cNvGraphicFramePr>
+              <a:graphicFrameLocks xmlns:a="http://schemas.openxmlformats.org/drawingml/2006/main" noChangeAspect="1"/>
+            </wp:cNvGraphicFramePr>
+            <a:graphic xmlns:a="http://schemas.openxmlformats.org/drawingml/2006/main">
+              <a:graphicData uri="http://schemas.openxmlformats.org/drawingml/2006/picture">
+                <pic:pic xmlns:pic="http://schemas.openxmlformats.org/drawingml/2006/picture">
+                  <pic:nvPicPr>
+                    <pic:cNvPr id="101" name="architecture.png"/>
+                    <pic:cNvPicPr/>
+                  </pic:nvPicPr>
+                  <pic:blipFill>
+                    <a:blip r:embed="rId13"/>
+                    <a:stretch>
+                      <a:fillRect/>
+                    </a:stretch>
+                  </pic:blipFill>
+                  <pic:spPr>
+                    <a:xfrm>
+                      <a:off x="0" y="0"/>
+                      <a:ext cx="5943600" cy="3913762"/>
+                    </a:xfrm>
+                    <a:prstGeom prst="rect">
+                      <a:avLst/>
+                    </a:prstGeom>
+                  </pic:spPr>
+                </pic:pic>
+              </a:graphicData>
+            </a:graphic>
+          </wp:inline>
+        </w:drawing>
+      </w:r>
+    </w:p>
+    <w:p>
+      <w:pPr>
+        <w:jc w:val="center"/>
         <w:rPr>
-          <w:i/>
-          <w:color w:val="0000FF"/>
+          <w:b/>
+          <w:sz w:val="20"/>
         </w:rPr>
       </w:pPr>
       <w:r>
         <w:rPr>
-          <w:i/>
-          <w:color w:val="0000FF"/>
+          <w:b/>
+          <w:sz w:val="20"/>
         </w:rPr>
-        <w:t xml:space="preserve">[ Figure 1-1: PCMS System Architecture (container view) — diagram to be added ]</w:t>
+        <w:t>Figure 1-1: PCMS System Architecture (container view)</w:t>
       </w:r>
     </w:p>
     <w:p>
@@ -3421,19 +3463,7 @@
                 <w:szCs w:val="18"/>
               </w:rPr>
               <w:br/>
-            </w:r>
-            <w:r>
-              <w:rPr>
-                <w:sz w:val="18"/>
-                <w:szCs w:val="18"/>
-              </w:rPr>
               <w:t xml:space="preserve">id (UUID)</w:t>
-            </w:r>
-            <w:r>
-              <w:rPr>
-                <w:sz w:val="18"/>
-                <w:szCs w:val="18"/>
-              </w:rPr>
               <w:br/>
             </w:r>
             <w:r>
@@ -3451,12 +3481,6 @@
                 <w:szCs w:val="18"/>
               </w:rPr>
               <w:br/>
-            </w:r>
-            <w:r>
-              <w:rPr>
-                <w:sz w:val="18"/>
-                <w:szCs w:val="18"/>
-              </w:rPr>
               <w:t xml:space="preserve">none (cross-service refs by id only)</w:t>
             </w:r>
           </w:p>
@@ -3604,19 +3628,7 @@
                 <w:szCs w:val="18"/>
               </w:rPr>
               <w:br/>
-            </w:r>
-            <w:r>
-              <w:rPr>
-                <w:sz w:val="18"/>
-                <w:szCs w:val="18"/>
-              </w:rPr>
               <w:t xml:space="preserve">id (UUID)</w:t>
-            </w:r>
-            <w:r>
-              <w:rPr>
-                <w:sz w:val="18"/>
-                <w:szCs w:val="18"/>
-              </w:rPr>
               <w:br/>
             </w:r>
             <w:r>
@@ -3634,12 +3646,6 @@
                 <w:szCs w:val="18"/>
               </w:rPr>
               <w:br/>
-            </w:r>
-            <w:r>
-              <w:rPr>
-                <w:sz w:val="18"/>
-                <w:szCs w:val="18"/>
-              </w:rPr>
               <w:t xml:space="preserve">none (cross-service refs by id only)</w:t>
             </w:r>
           </w:p>
@@ -3787,19 +3793,7 @@
                 <w:szCs w:val="18"/>
               </w:rPr>
               <w:br/>
-            </w:r>
-            <w:r>
-              <w:rPr>
-                <w:sz w:val="18"/>
-                <w:szCs w:val="18"/>
-              </w:rPr>
               <w:t xml:space="preserve">id (UUID)</w:t>
-            </w:r>
-            <w:r>
-              <w:rPr>
-                <w:sz w:val="18"/>
-                <w:szCs w:val="18"/>
-              </w:rPr>
               <w:br/>
             </w:r>
             <w:r>
@@ -3817,12 +3811,6 @@
                 <w:szCs w:val="18"/>
               </w:rPr>
               <w:br/>
-            </w:r>
-            <w:r>
-              <w:rPr>
-                <w:sz w:val="18"/>
-                <w:szCs w:val="18"/>
-              </w:rPr>
               <w:t xml:space="preserve">user_id -&gt; auth.users(id)</w:t>
             </w:r>
           </w:p>
@@ -3970,19 +3958,7 @@
                 <w:szCs w:val="18"/>
               </w:rPr>
               <w:br/>
-            </w:r>
-            <w:r>
-              <w:rPr>
-                <w:sz w:val="18"/>
-                <w:szCs w:val="18"/>
-              </w:rPr>
               <w:t xml:space="preserve">id (UUID)</w:t>
-            </w:r>
-            <w:r>
-              <w:rPr>
-                <w:sz w:val="18"/>
-                <w:szCs w:val="18"/>
-              </w:rPr>
               <w:br/>
             </w:r>
             <w:r>
@@ -4000,12 +3976,6 @@
                 <w:szCs w:val="18"/>
               </w:rPr>
               <w:br/>
-            </w:r>
-            <w:r>
-              <w:rPr>
-                <w:sz w:val="18"/>
-                <w:szCs w:val="18"/>
-              </w:rPr>
               <w:t xml:space="preserve">none (cross-service refs by id only)</w:t>
             </w:r>
           </w:p>
@@ -4153,19 +4123,7 @@
                 <w:szCs w:val="18"/>
               </w:rPr>
               <w:br/>
-            </w:r>
-            <w:r>
-              <w:rPr>
-                <w:sz w:val="18"/>
-                <w:szCs w:val="18"/>
-              </w:rPr>
               <w:t xml:space="preserve">id (UUID)</w:t>
-            </w:r>
-            <w:r>
-              <w:rPr>
-                <w:sz w:val="18"/>
-                <w:szCs w:val="18"/>
-              </w:rPr>
               <w:br/>
             </w:r>
             <w:r>
@@ -4183,12 +4141,6 @@
                 <w:szCs w:val="18"/>
               </w:rPr>
               <w:br/>
-            </w:r>
-            <w:r>
-              <w:rPr>
-                <w:sz w:val="18"/>
-                <w:szCs w:val="18"/>
-              </w:rPr>
               <w:t xml:space="preserve">owner_id -&gt; customers.owners(id); pet_type_id -&gt; customers.pet_types(id)</w:t>
             </w:r>
           </w:p>
@@ -4336,19 +4288,7 @@
                 <w:szCs w:val="18"/>
               </w:rPr>
               <w:br/>
-            </w:r>
-            <w:r>
-              <w:rPr>
-                <w:sz w:val="18"/>
-                <w:szCs w:val="18"/>
-              </w:rPr>
               <w:t xml:space="preserve">id (UUID)</w:t>
-            </w:r>
-            <w:r>
-              <w:rPr>
-                <w:sz w:val="18"/>
-                <w:szCs w:val="18"/>
-              </w:rPr>
               <w:br/>
             </w:r>
             <w:r>
@@ -4366,12 +4306,6 @@
                 <w:szCs w:val="18"/>
               </w:rPr>
               <w:br/>
-            </w:r>
-            <w:r>
-              <w:rPr>
-                <w:sz w:val="18"/>
-                <w:szCs w:val="18"/>
-              </w:rPr>
               <w:t xml:space="preserve">none (cross-service refs by id only)</w:t>
             </w:r>
           </w:p>
@@ -4519,19 +4453,7 @@
                 <w:szCs w:val="18"/>
               </w:rPr>
               <w:br/>
-            </w:r>
-            <w:r>
-              <w:rPr>
-                <w:sz w:val="18"/>
-                <w:szCs w:val="18"/>
-              </w:rPr>
               <w:t xml:space="preserve">id (UUID)</w:t>
-            </w:r>
-            <w:r>
-              <w:rPr>
-                <w:sz w:val="18"/>
-                <w:szCs w:val="18"/>
-              </w:rPr>
               <w:br/>
             </w:r>
             <w:r>
@@ -4549,12 +4471,6 @@
                 <w:szCs w:val="18"/>
               </w:rPr>
               <w:br/>
-            </w:r>
-            <w:r>
-              <w:rPr>
-                <w:sz w:val="18"/>
-                <w:szCs w:val="18"/>
-              </w:rPr>
               <w:t xml:space="preserve">none (cross-service refs by id only)</w:t>
             </w:r>
           </w:p>
@@ -4702,19 +4618,7 @@
                 <w:szCs w:val="18"/>
               </w:rPr>
               <w:br/>
-            </w:r>
-            <w:r>
-              <w:rPr>
-                <w:sz w:val="18"/>
-                <w:szCs w:val="18"/>
-              </w:rPr>
               <w:t xml:space="preserve">id (UUID)</w:t>
-            </w:r>
-            <w:r>
-              <w:rPr>
-                <w:sz w:val="18"/>
-                <w:szCs w:val="18"/>
-              </w:rPr>
               <w:br/>
             </w:r>
             <w:r>
@@ -4732,12 +4636,6 @@
                 <w:szCs w:val="18"/>
               </w:rPr>
               <w:br/>
-            </w:r>
-            <w:r>
-              <w:rPr>
-                <w:sz w:val="18"/>
-                <w:szCs w:val="18"/>
-              </w:rPr>
               <w:t xml:space="preserve">none (cross-service refs by id only)</w:t>
             </w:r>
           </w:p>
@@ -4885,19 +4783,7 @@
                 <w:szCs w:val="18"/>
               </w:rPr>
               <w:br/>
-            </w:r>
-            <w:r>
-              <w:rPr>
-                <w:sz w:val="18"/>
-                <w:szCs w:val="18"/>
-              </w:rPr>
               <w:t xml:space="preserve">vet_id, specialty_id</w:t>
-            </w:r>
-            <w:r>
-              <w:rPr>
-                <w:sz w:val="18"/>
-                <w:szCs w:val="18"/>
-              </w:rPr>
               <w:br/>
             </w:r>
             <w:r>
@@ -4915,12 +4801,6 @@
                 <w:szCs w:val="18"/>
               </w:rPr>
               <w:br/>
-            </w:r>
-            <w:r>
-              <w:rPr>
-                <w:sz w:val="18"/>
-                <w:szCs w:val="18"/>
-              </w:rPr>
               <w:t xml:space="preserve">vet_id -&gt; vets.vets(id); specialty_id -&gt; vets.specialties(id)</w:t>
             </w:r>
           </w:p>
@@ -5068,19 +4948,7 @@
                 <w:szCs w:val="18"/>
               </w:rPr>
               <w:br/>
-            </w:r>
-            <w:r>
-              <w:rPr>
-                <w:sz w:val="18"/>
-                <w:szCs w:val="18"/>
-              </w:rPr>
               <w:t xml:space="preserve">id (UUID)</w:t>
-            </w:r>
-            <w:r>
-              <w:rPr>
-                <w:sz w:val="18"/>
-                <w:szCs w:val="18"/>
-              </w:rPr>
               <w:br/>
             </w:r>
             <w:r>
@@ -5098,12 +4966,6 @@
                 <w:szCs w:val="18"/>
               </w:rPr>
               <w:br/>
-            </w:r>
-            <w:r>
-              <w:rPr>
-                <w:sz w:val="18"/>
-                <w:szCs w:val="18"/>
-              </w:rPr>
               <w:t xml:space="preserve">vet_id -&gt; vets.vets(id)</w:t>
             </w:r>
           </w:p>
@@ -5251,19 +5113,7 @@
                 <w:szCs w:val="18"/>
               </w:rPr>
               <w:br/>
-            </w:r>
-            <w:r>
-              <w:rPr>
-                <w:sz w:val="18"/>
-                <w:szCs w:val="18"/>
-              </w:rPr>
               <w:t xml:space="preserve">vet_id, workday, work_hour</w:t>
-            </w:r>
-            <w:r>
-              <w:rPr>
-                <w:sz w:val="18"/>
-                <w:szCs w:val="18"/>
-              </w:rPr>
               <w:br/>
             </w:r>
             <w:r>
@@ -5281,12 +5131,6 @@
                 <w:szCs w:val="18"/>
               </w:rPr>
               <w:br/>
-            </w:r>
-            <w:r>
-              <w:rPr>
-                <w:sz w:val="18"/>
-                <w:szCs w:val="18"/>
-              </w:rPr>
               <w:t xml:space="preserve">vet_id -&gt; vets.vets(id)</w:t>
             </w:r>
           </w:p>
@@ -5434,19 +5278,7 @@
                 <w:szCs w:val="18"/>
               </w:rPr>
               <w:br/>
-            </w:r>
-            <w:r>
-              <w:rPr>
-                <w:sz w:val="18"/>
-                <w:szCs w:val="18"/>
-              </w:rPr>
               <w:t xml:space="preserve">id (UUID)</w:t>
-            </w:r>
-            <w:r>
-              <w:rPr>
-                <w:sz w:val="18"/>
-                <w:szCs w:val="18"/>
-              </w:rPr>
               <w:br/>
             </w:r>
             <w:r>
@@ -5464,12 +5296,6 @@
                 <w:szCs w:val="18"/>
               </w:rPr>
               <w:br/>
-            </w:r>
-            <w:r>
-              <w:rPr>
-                <w:sz w:val="18"/>
-                <w:szCs w:val="18"/>
-              </w:rPr>
               <w:t xml:space="preserve">vet_id -&gt; vets.vets(id)</w:t>
             </w:r>
           </w:p>
@@ -5617,19 +5443,7 @@
                 <w:szCs w:val="18"/>
               </w:rPr>
               <w:br/>
-            </w:r>
-            <w:r>
-              <w:rPr>
-                <w:sz w:val="18"/>
-                <w:szCs w:val="18"/>
-              </w:rPr>
               <w:t xml:space="preserve">id (UUID)</w:t>
-            </w:r>
-            <w:r>
-              <w:rPr>
-                <w:sz w:val="18"/>
-                <w:szCs w:val="18"/>
-              </w:rPr>
               <w:br/>
             </w:r>
             <w:r>
@@ -5647,12 +5461,6 @@
                 <w:szCs w:val="18"/>
               </w:rPr>
               <w:br/>
-            </w:r>
-            <w:r>
-              <w:rPr>
-                <w:sz w:val="18"/>
-                <w:szCs w:val="18"/>
-              </w:rPr>
               <w:t xml:space="preserve">vet_id -&gt; vets.vets(id)</w:t>
             </w:r>
           </w:p>
@@ -5800,19 +5608,7 @@
                 <w:szCs w:val="18"/>
               </w:rPr>
               <w:br/>
-            </w:r>
-            <w:r>
-              <w:rPr>
-                <w:sz w:val="18"/>
-                <w:szCs w:val="18"/>
-              </w:rPr>
               <w:t xml:space="preserve">id (UUID)</w:t>
-            </w:r>
-            <w:r>
-              <w:rPr>
-                <w:sz w:val="18"/>
-                <w:szCs w:val="18"/>
-              </w:rPr>
               <w:br/>
             </w:r>
             <w:r>
@@ -5830,12 +5626,6 @@
                 <w:szCs w:val="18"/>
               </w:rPr>
               <w:br/>
-            </w:r>
-            <w:r>
-              <w:rPr>
-                <w:sz w:val="18"/>
-                <w:szCs w:val="18"/>
-              </w:rPr>
               <w:t xml:space="preserve">vet_id -&gt; vets.vets(id)</w:t>
             </w:r>
           </w:p>
@@ -5983,19 +5773,7 @@
                 <w:szCs w:val="18"/>
               </w:rPr>
               <w:br/>
-            </w:r>
-            <w:r>
-              <w:rPr>
-                <w:sz w:val="18"/>
-                <w:szCs w:val="18"/>
-              </w:rPr>
               <w:t xml:space="preserve">id (UUID)</w:t>
-            </w:r>
-            <w:r>
-              <w:rPr>
-                <w:sz w:val="18"/>
-                <w:szCs w:val="18"/>
-              </w:rPr>
               <w:br/>
             </w:r>
             <w:r>
@@ -6013,12 +5791,6 @@
                 <w:szCs w:val="18"/>
               </w:rPr>
               <w:br/>
-            </w:r>
-            <w:r>
-              <w:rPr>
-                <w:sz w:val="18"/>
-                <w:szCs w:val="18"/>
-              </w:rPr>
               <w:t xml:space="preserve">logical refs: pet_id, vet_id, customer_user_id</w:t>
             </w:r>
           </w:p>
@@ -6166,19 +5938,7 @@
                 <w:szCs w:val="18"/>
               </w:rPr>
               <w:br/>
-            </w:r>
-            <w:r>
-              <w:rPr>
-                <w:sz w:val="18"/>
-                <w:szCs w:val="18"/>
-              </w:rPr>
               <w:t xml:space="preserve">id (UUID)</w:t>
-            </w:r>
-            <w:r>
-              <w:rPr>
-                <w:sz w:val="18"/>
-                <w:szCs w:val="18"/>
-              </w:rPr>
               <w:br/>
             </w:r>
             <w:r>
@@ -6196,12 +5956,6 @@
                 <w:szCs w:val="18"/>
               </w:rPr>
               <w:br/>
-            </w:r>
-            <w:r>
-              <w:rPr>
-                <w:sz w:val="18"/>
-                <w:szCs w:val="18"/>
-              </w:rPr>
               <w:t xml:space="preserve">visit_id -&gt; visits.visits(id)</w:t>
             </w:r>
           </w:p>
@@ -6349,19 +6103,7 @@
                 <w:szCs w:val="18"/>
               </w:rPr>
               <w:br/>
-            </w:r>
-            <w:r>
-              <w:rPr>
-                <w:sz w:val="18"/>
-                <w:szCs w:val="18"/>
-              </w:rPr>
               <w:t xml:space="preserve">id (UUID)</w:t>
-            </w:r>
-            <w:r>
-              <w:rPr>
-                <w:sz w:val="18"/>
-                <w:szCs w:val="18"/>
-              </w:rPr>
               <w:br/>
             </w:r>
             <w:r>
@@ -6379,12 +6121,6 @@
                 <w:szCs w:val="18"/>
               </w:rPr>
               <w:br/>
-            </w:r>
-            <w:r>
-              <w:rPr>
-                <w:sz w:val="18"/>
-                <w:szCs w:val="18"/>
-              </w:rPr>
               <w:t xml:space="preserve">prescription_id -&gt; visits.prescriptions(id); medicine_id -&gt; products.products(id)</w:t>
             </w:r>
           </w:p>
@@ -6532,19 +6268,7 @@
                 <w:szCs w:val="18"/>
               </w:rPr>
               <w:br/>
-            </w:r>
-            <w:r>
-              <w:rPr>
-                <w:sz w:val="18"/>
-                <w:szCs w:val="18"/>
-              </w:rPr>
               <w:t xml:space="preserve">id (UUID)</w:t>
-            </w:r>
-            <w:r>
-              <w:rPr>
-                <w:sz w:val="18"/>
-                <w:szCs w:val="18"/>
-              </w:rPr>
               <w:br/>
             </w:r>
             <w:r>
@@ -6562,12 +6286,6 @@
                 <w:szCs w:val="18"/>
               </w:rPr>
               <w:br/>
-            </w:r>
-            <w:r>
-              <w:rPr>
-                <w:sz w:val="18"/>
-                <w:szCs w:val="18"/>
-              </w:rPr>
               <w:t xml:space="preserve">none (cross-service refs by id only)</w:t>
             </w:r>
           </w:p>
@@ -6715,19 +6433,7 @@
                 <w:szCs w:val="18"/>
               </w:rPr>
               <w:br/>
-            </w:r>
-            <w:r>
-              <w:rPr>
-                <w:sz w:val="18"/>
-                <w:szCs w:val="18"/>
-              </w:rPr>
               <w:t xml:space="preserve">id (UUID)</w:t>
-            </w:r>
-            <w:r>
-              <w:rPr>
-                <w:sz w:val="18"/>
-                <w:szCs w:val="18"/>
-              </w:rPr>
               <w:br/>
             </w:r>
             <w:r>
@@ -6745,12 +6451,6 @@
                 <w:szCs w:val="18"/>
               </w:rPr>
               <w:br/>
-            </w:r>
-            <w:r>
-              <w:rPr>
-                <w:sz w:val="18"/>
-                <w:szCs w:val="18"/>
-              </w:rPr>
               <w:t xml:space="preserve">none (cross-service refs by id only)</w:t>
             </w:r>
           </w:p>
@@ -6898,19 +6598,7 @@
                 <w:szCs w:val="18"/>
               </w:rPr>
               <w:br/>
-            </w:r>
-            <w:r>
-              <w:rPr>
-                <w:sz w:val="18"/>
-                <w:szCs w:val="18"/>
-              </w:rPr>
               <w:t xml:space="preserve">id (UUID)</w:t>
-            </w:r>
-            <w:r>
-              <w:rPr>
-                <w:sz w:val="18"/>
-                <w:szCs w:val="18"/>
-              </w:rPr>
               <w:br/>
             </w:r>
             <w:r>
@@ -6928,12 +6616,6 @@
                 <w:szCs w:val="18"/>
               </w:rPr>
               <w:br/>
-            </w:r>
-            <w:r>
-              <w:rPr>
-                <w:sz w:val="18"/>
-                <w:szCs w:val="18"/>
-              </w:rPr>
               <w:t xml:space="preserve">review_id -&gt; reviews.reviews(id)</w:t>
             </w:r>
           </w:p>
@@ -7081,19 +6763,7 @@
                 <w:szCs w:val="18"/>
               </w:rPr>
               <w:br/>
-            </w:r>
-            <w:r>
-              <w:rPr>
-                <w:sz w:val="18"/>
-                <w:szCs w:val="18"/>
-              </w:rPr>
               <w:t xml:space="preserve">id (UUID)</w:t>
-            </w:r>
-            <w:r>
-              <w:rPr>
-                <w:sz w:val="18"/>
-                <w:szCs w:val="18"/>
-              </w:rPr>
               <w:br/>
             </w:r>
             <w:r>
@@ -7111,12 +6781,6 @@
                 <w:szCs w:val="18"/>
               </w:rPr>
               <w:br/>
-            </w:r>
-            <w:r>
-              <w:rPr>
-                <w:sz w:val="18"/>
-                <w:szCs w:val="18"/>
-              </w:rPr>
               <w:t xml:space="preserve">none (cross-service refs by id only)</w:t>
             </w:r>
           </w:p>
@@ -7264,19 +6928,7 @@
                 <w:szCs w:val="18"/>
               </w:rPr>
               <w:br/>
-            </w:r>
-            <w:r>
-              <w:rPr>
-                <w:sz w:val="18"/>
-                <w:szCs w:val="18"/>
-              </w:rPr>
               <w:t xml:space="preserve">id (UUID)</w:t>
-            </w:r>
-            <w:r>
-              <w:rPr>
-                <w:sz w:val="18"/>
-                <w:szCs w:val="18"/>
-              </w:rPr>
               <w:br/>
             </w:r>
             <w:r>
@@ -7294,12 +6946,6 @@
                 <w:szCs w:val="18"/>
               </w:rPr>
               <w:br/>
-            </w:r>
-            <w:r>
-              <w:rPr>
-                <w:sz w:val="18"/>
-                <w:szCs w:val="18"/>
-              </w:rPr>
               <w:t xml:space="preserve">category_id -&gt; products.product_categories(id)</w:t>
             </w:r>
           </w:p>
@@ -7447,19 +7093,7 @@
                 <w:szCs w:val="18"/>
               </w:rPr>
               <w:br/>
-            </w:r>
-            <w:r>
-              <w:rPr>
-                <w:sz w:val="18"/>
-                <w:szCs w:val="18"/>
-              </w:rPr>
               <w:t xml:space="preserve">id (UUID)</w:t>
-            </w:r>
-            <w:r>
-              <w:rPr>
-                <w:sz w:val="18"/>
-                <w:szCs w:val="18"/>
-              </w:rPr>
               <w:br/>
             </w:r>
             <w:r>
@@ -7477,12 +7111,6 @@
                 <w:szCs w:val="18"/>
               </w:rPr>
               <w:br/>
-            </w:r>
-            <w:r>
-              <w:rPr>
-                <w:sz w:val="18"/>
-                <w:szCs w:val="18"/>
-              </w:rPr>
               <w:t xml:space="preserve">product_id -&gt; products.products(id)</w:t>
             </w:r>
           </w:p>
@@ -7630,19 +7258,7 @@
                 <w:szCs w:val="18"/>
               </w:rPr>
               <w:br/>
-            </w:r>
-            <w:r>
-              <w:rPr>
-                <w:sz w:val="18"/>
-                <w:szCs w:val="18"/>
-              </w:rPr>
               <w:t xml:space="preserve">id (UUID)</w:t>
-            </w:r>
-            <w:r>
-              <w:rPr>
-                <w:sz w:val="18"/>
-                <w:szCs w:val="18"/>
-              </w:rPr>
               <w:br/>
             </w:r>
             <w:r>
@@ -7660,12 +7276,6 @@
                 <w:szCs w:val="18"/>
               </w:rPr>
               <w:br/>
-            </w:r>
-            <w:r>
-              <w:rPr>
-                <w:sz w:val="18"/>
-                <w:szCs w:val="18"/>
-              </w:rPr>
               <w:t xml:space="preserve">logical refs: visit_id, owner_id</w:t>
             </w:r>
           </w:p>
@@ -7813,19 +7423,7 @@
                 <w:szCs w:val="18"/>
               </w:rPr>
               <w:br/>
-            </w:r>
-            <w:r>
-              <w:rPr>
-                <w:sz w:val="18"/>
-                <w:szCs w:val="18"/>
-              </w:rPr>
               <w:t xml:space="preserve">id (UUID)</w:t>
-            </w:r>
-            <w:r>
-              <w:rPr>
-                <w:sz w:val="18"/>
-                <w:szCs w:val="18"/>
-              </w:rPr>
               <w:br/>
             </w:r>
             <w:r>
@@ -7843,12 +7441,6 @@
                 <w:szCs w:val="18"/>
               </w:rPr>
               <w:br/>
-            </w:r>
-            <w:r>
-              <w:rPr>
-                <w:sz w:val="18"/>
-                <w:szCs w:val="18"/>
-              </w:rPr>
               <w:t xml:space="preserve">bill_id -&gt; billing.bills(id); product_id -&gt; products.products(id)</w:t>
             </w:r>
           </w:p>
@@ -7996,19 +7588,7 @@
                 <w:szCs w:val="18"/>
               </w:rPr>
               <w:br/>
-            </w:r>
-            <w:r>
-              <w:rPr>
-                <w:sz w:val="18"/>
-                <w:szCs w:val="18"/>
-              </w:rPr>
               <w:t xml:space="preserve">id (UUID)</w:t>
-            </w:r>
-            <w:r>
-              <w:rPr>
-                <w:sz w:val="18"/>
-                <w:szCs w:val="18"/>
-              </w:rPr>
               <w:br/>
             </w:r>
             <w:r>
@@ -8026,12 +7606,6 @@
                 <w:szCs w:val="18"/>
               </w:rPr>
               <w:br/>
-            </w:r>
-            <w:r>
-              <w:rPr>
-                <w:sz w:val="18"/>
-                <w:szCs w:val="18"/>
-              </w:rPr>
               <w:t xml:space="preserve">bill_id -&gt; billing.bills(id)</w:t>
             </w:r>
           </w:p>
@@ -8179,19 +7753,7 @@
                 <w:szCs w:val="18"/>
               </w:rPr>
               <w:br/>
-            </w:r>
-            <w:r>
-              <w:rPr>
-                <w:sz w:val="18"/>
-                <w:szCs w:val="18"/>
-              </w:rPr>
               <w:t xml:space="preserve">id (UUID)</w:t>
-            </w:r>
-            <w:r>
-              <w:rPr>
-                <w:sz w:val="18"/>
-                <w:szCs w:val="18"/>
-              </w:rPr>
               <w:br/>
             </w:r>
             <w:r>
@@ -8209,12 +7771,6 @@
                 <w:szCs w:val="18"/>
               </w:rPr>
               <w:br/>
-            </w:r>
-            <w:r>
-              <w:rPr>
-                <w:sz w:val="18"/>
-                <w:szCs w:val="18"/>
-              </w:rPr>
               <w:t xml:space="preserve">none (cross-service refs by id only)</w:t>
             </w:r>
           </w:p>
@@ -8362,19 +7918,7 @@
                 <w:szCs w:val="18"/>
               </w:rPr>
               <w:br/>
-            </w:r>
-            <w:r>
-              <w:rPr>
-                <w:sz w:val="18"/>
-                <w:szCs w:val="18"/>
-              </w:rPr>
               <w:t xml:space="preserve">id (UUID)</w:t>
-            </w:r>
-            <w:r>
-              <w:rPr>
-                <w:sz w:val="18"/>
-                <w:szCs w:val="18"/>
-              </w:rPr>
               <w:br/>
             </w:r>
             <w:r>
@@ -8392,12 +7936,6 @@
                 <w:szCs w:val="18"/>
               </w:rPr>
               <w:br/>
-            </w:r>
-            <w:r>
-              <w:rPr>
-                <w:sz w:val="18"/>
-                <w:szCs w:val="18"/>
-              </w:rPr>
               <w:t xml:space="preserve">none (cross-service refs by id only)</w:t>
             </w:r>
           </w:p>
@@ -8545,19 +8083,7 @@
                 <w:szCs w:val="18"/>
               </w:rPr>
               <w:br/>
-            </w:r>
-            <w:r>
-              <w:rPr>
-                <w:sz w:val="18"/>
-                <w:szCs w:val="18"/>
-              </w:rPr>
               <w:t xml:space="preserve">composite (conversation + ordinal)</w:t>
-            </w:r>
-            <w:r>
-              <w:rPr>
-                <w:sz w:val="18"/>
-                <w:szCs w:val="18"/>
-              </w:rPr>
               <w:br/>
             </w:r>
             <w:r>
@@ -8575,12 +8101,6 @@
                 <w:szCs w:val="18"/>
               </w:rPr>
               <w:br/>
-            </w:r>
-            <w:r>
-              <w:rPr>
-                <w:sz w:val="18"/>
-                <w:szCs w:val="18"/>
-              </w:rPr>
               <w:t xml:space="preserve">none (cross-service refs by id only)</w:t>
             </w:r>
           </w:p>
@@ -8728,19 +8248,7 @@
                 <w:szCs w:val="18"/>
               </w:rPr>
               <w:br/>
-            </w:r>
-            <w:r>
-              <w:rPr>
-                <w:sz w:val="18"/>
-                <w:szCs w:val="18"/>
-              </w:rPr>
               <w:t xml:space="preserve">id (UUID)</w:t>
-            </w:r>
-            <w:r>
-              <w:rPr>
-                <w:sz w:val="18"/>
-                <w:szCs w:val="18"/>
-              </w:rPr>
               <w:br/>
             </w:r>
             <w:r>
@@ -8758,12 +8266,6 @@
                 <w:szCs w:val="18"/>
               </w:rPr>
               <w:br/>
-            </w:r>
-            <w:r>
-              <w:rPr>
-                <w:sz w:val="18"/>
-                <w:szCs w:val="18"/>
-              </w:rPr>
               <w:t xml:space="preserve">none (cross-service refs by id only)</w:t>
             </w:r>
           </w:p>

</xml_diff>

<commit_message>
docs(sdd): add section 4 Deployment & Observability + Figure 4-1
GKE deployment architecture (stateless on k8s, stateful + LGTM on VMs),
component placement table, observability data flow (Alloy -> Prometheus/Loki/
Tempo), and free-trial cloud notes. Embeds the deployment diagram.

Co-Authored-By: Claude Opus 4.8 <noreply@anthropic.com>
</commit_message>
<xml_diff>
--- a/docs/SDD_PCMS_v1.0.docx
+++ b/docs/SDD_PCMS_v1.0.docx
@@ -13652,6 +13652,867 @@
           <w:color w:val="0000FF"/>
         </w:rPr>
         <w:t xml:space="preserve">[ Figure: Configure LLM (BYOK) sequence diagram — diagram to be added ]</w:t>
+      </w:r>
+    </w:p>
+    <w:p>
+      <w:pPr>
+        <w:pStyle w:val="Heading2"/>
+      </w:pPr>
+      <w:bookmarkStart w:id="30" w:name="_Toc_pcms_deploy"/>
+      <w:r>
+        <w:t xml:space="preserve">4. Deployment &amp; Observability</w:t>
+      </w:r>
+      <w:bookmarkEnd w:id="30"/>
+    </w:p>
+    <w:p>
+      <w:pPr>
+        <w:jc w:val="both"/>
+      </w:pPr>
+      <w:r>
+        <w:t xml:space="preserve">For the course demo, PCMS is deployed to Google Cloud (GKE) using the free-trial credit. The deployment follows a pragmatic-pro split: stateless services run on Google Kubernetes Engine, while stateful backends and the observability stack run on dedicated Compute Engine VMs in the same VPC. This isolates the application, data and monitoring tiers so a failure in one does not cascade, and keeps databases off vanilla Kubernetes (avoiding StatefulSet/operator complexity). The manifests live under k8s/ in the repo.</w:t>
+      </w:r>
+    </w:p>
+    <w:p>
+      <w:pPr>
+        <w:pStyle w:val="Heading3"/>
+      </w:pPr>
+      <w:bookmarkStart w:id="31" w:name="_Toc_pcms_deploy_arch"/>
+      <w:r>
+        <w:t xml:space="preserve">4.1 Deployment Architecture (GKE)</w:t>
+      </w:r>
+      <w:bookmarkEnd w:id="31"/>
+    </w:p>
+    <w:p>
+      <w:pPr>
+        <w:jc w:val="both"/>
+      </w:pPr>
+      <w:r>
+        <w:t xml:space="preserve">The API Gateway is the only public entry point, exposed through a Google Cloud HTTP(S) Load Balancer (GKE Ingress); the React SPA is served from Cloud Storage + Cloud CDN. Service images are built into Artifact Registry and pulled by the cluster. Pods reach the off-cluster VMs through selector-less Kubernetes Services that map stable DNS names (postgres, rabbitmq, redis, minio, camunda, otel-collector) to the VMs' internal IPs.</w:t>
+      </w:r>
+    </w:p>
+    <w:p>
+      <w:pPr>
+        <w:jc w:val="center"/>
+      </w:pPr>
+      <w:r>
+        <w:drawing>
+          <wp:inline distT="0" distB="0" distL="0" distR="0">
+            <wp:extent cx="5943600" cy="4343169"/>
+            <wp:effectExtent l="0" t="0" r="0" b="0"/>
+            <wp:docPr id="102" name="Figure 4-1: PCMS GKE Deployment Architecture"/>
+            <wp:cNvGraphicFramePr>
+              <a:graphicFrameLocks xmlns:a="http://schemas.openxmlformats.org/drawingml/2006/main" noChangeAspect="1"/>
+            </wp:cNvGraphicFramePr>
+            <a:graphic xmlns:a="http://schemas.openxmlformats.org/drawingml/2006/main">
+              <a:graphicData uri="http://schemas.openxmlformats.org/drawingml/2006/picture">
+                <pic:pic xmlns:pic="http://schemas.openxmlformats.org/drawingml/2006/picture">
+                  <pic:nvPicPr>
+                    <pic:cNvPr id="102" name="deployment.png"/>
+                    <pic:cNvPicPr/>
+                  </pic:nvPicPr>
+                  <pic:blipFill>
+                    <a:blip r:embed="rId14"/>
+                    <a:stretch>
+                      <a:fillRect/>
+                    </a:stretch>
+                  </pic:blipFill>
+                  <pic:spPr>
+                    <a:xfrm>
+                      <a:off x="0" y="0"/>
+                      <a:ext cx="5943600" cy="4343169"/>
+                    </a:xfrm>
+                    <a:prstGeom prst="rect">
+                      <a:avLst/>
+                    </a:prstGeom>
+                  </pic:spPr>
+                </pic:pic>
+              </a:graphicData>
+            </a:graphic>
+          </wp:inline>
+        </w:drawing>
+      </w:r>
+    </w:p>
+    <w:p>
+      <w:pPr>
+        <w:jc w:val="center"/>
+        <w:rPr>
+          <w:b/>
+          <w:sz w:val="20"/>
+        </w:rPr>
+      </w:pPr>
+      <w:r>
+        <w:rPr>
+          <w:b/>
+          <w:sz w:val="20"/>
+        </w:rPr>
+        <w:t>Figure 4-1: PCMS GKE Deployment Architecture</w:t>
+      </w:r>
+    </w:p>
+    <w:p>
+      <w:pPr>
+        <w:ind w:left="360"/>
+        <w:jc w:val="both"/>
+      </w:pPr>
+      <w:r>
+        <w:rPr>
+          <w:b/>
+        </w:rPr>
+        <w:t xml:space="preserve">• GKE cluster (e2-standard-8)</w:t>
+      </w:r>
+      <w:r>
+        <w:t xml:space="preserve"> – stateless tier: api-gateway, the platform services (config-server, discovery/Eureka, admin-server) and the business/AI services, plus the in-cluster Alloy DaemonSet.</w:t>
+      </w:r>
+    </w:p>
+    <w:p>
+      <w:pPr>
+        <w:ind w:left="360"/>
+        <w:jc w:val="both"/>
+      </w:pPr>
+      <w:r>
+        <w:rPr>
+          <w:b/>
+        </w:rPr>
+        <w:t xml:space="preserve">• Data / Infra VM (e2-standard-8)</w:t>
+      </w:r>
+      <w:r>
+        <w:t xml:space="preserve"> – Postgres 18 + pgvector, RabbitMQ, Redis, MinIO, and Camunda 8 + Elasticsearch — all stateful backends via docker-compose.</w:t>
+      </w:r>
+    </w:p>
+    <w:p>
+      <w:pPr>
+        <w:ind w:left="360"/>
+        <w:jc w:val="both"/>
+      </w:pPr>
+      <w:r>
+        <w:rPr>
+          <w:b/>
+        </w:rPr>
+        <w:t xml:space="preserve">• Observability VM (e2-standard-4)</w:t>
+      </w:r>
+      <w:r>
+        <w:t xml:space="preserve"> – self-hosted Grafana LGTM, isolated from the cluster it monitors.</w:t>
+      </w:r>
+    </w:p>
+    <w:p>
+      <w:pPr>
+        <w:ind w:left="360"/>
+        <w:jc w:val="both"/>
+      </w:pPr>
+      <w:r>
+        <w:rPr>
+          <w:b/>
+        </w:rPr>
+        <w:t xml:space="preserve">• Cloud Storage + CDN</w:t>
+      </w:r>
+      <w:r>
+        <w:t xml:space="preserve"> – hosts the React SPA (static).</w:t>
+      </w:r>
+    </w:p>
+    <w:p>
+      <w:pPr>
+        <w:ind w:left="360"/>
+        <w:jc w:val="both"/>
+      </w:pPr>
+      <w:r>
+        <w:rPr>
+          <w:b/>
+        </w:rPr>
+        <w:t xml:space="preserve">• Artifact Registry</w:t>
+      </w:r>
+      <w:r>
+        <w:t xml:space="preserve"> – stores the per-service container images.</w:t>
+      </w:r>
+    </w:p>
+    <w:p>
+      <w:pPr>
+        <w:pStyle w:val="Heading3"/>
+      </w:pPr>
+      <w:bookmarkStart w:id="32" w:name="_Toc_pcms_placement"/>
+      <w:r>
+        <w:t xml:space="preserve">4.2 Component Placement</w:t>
+      </w:r>
+      <w:bookmarkEnd w:id="32"/>
+    </w:p>
+    <w:p>
+      <w:pPr>
+        <w:jc w:val="both"/>
+      </w:pPr>
+      <w:r>
+        <w:t xml:space="preserve">Placement is driven by statefulness and blast-radius isolation:</w:t>
+      </w:r>
+    </w:p>
+    <w:tbl>
+      <w:tblPr>
+        <w:tblW w:w="5000" w:type="pct"/>
+        <w:tblInd w:w="-5" w:type="dxa"/>
+        <w:tblBorders>
+          <w:top w:val="single" w:sz="4" w:space="0" w:color="auto"/>
+          <w:left w:val="single" w:sz="4" w:space="0" w:color="auto"/>
+          <w:bottom w:val="single" w:sz="4" w:space="0" w:color="auto"/>
+          <w:right w:val="single" w:sz="4" w:space="0" w:color="auto"/>
+          <w:insideH w:val="single" w:sz="4" w:space="0" w:color="auto"/>
+          <w:insideV w:val="single" w:sz="4" w:space="0" w:color="auto"/>
+        </w:tblBorders>
+        <w:tblLayout w:type="fixed"/>
+        <w:tblLook w:val="0000" w:firstRow="0" w:lastRow="0" w:firstColumn="0" w:lastColumn="0" w:noHBand="0" w:noVBand="0"/>
+      </w:tblPr>
+      <w:tblGrid>
+        <w:gridCol w:w="2600"/>
+        <w:gridCol w:w="2200"/>
+        <w:gridCol w:w="4550"/>
+      </w:tblGrid>
+      <w:tr>
+        <w:tc>
+          <w:tcPr>
+            <w:tcW w:w="2600" w:type="dxa"/>
+            <w:shd w:val="clear" w:color="auto" w:fill="FFE8E1"/>
+            <w:vAlign w:val="center"/>
+          </w:tcPr>
+          <w:p>
+            <w:pPr>
+              <w:spacing w:after="0" w:line="240" w:lineRule="auto"/>
+              <w:jc w:val="center"/>
+              <w:rPr>
+                <w:b/>
+                <w:sz w:val="18"/>
+                <w:szCs w:val="18"/>
+              </w:rPr>
+            </w:pPr>
+            <w:r>
+              <w:rPr>
+                <w:b/>
+                <w:sz w:val="18"/>
+                <w:szCs w:val="18"/>
+              </w:rPr>
+              <w:t xml:space="preserve">Component</w:t>
+            </w:r>
+          </w:p>
+        </w:tc>
+        <w:tc>
+          <w:tcPr>
+            <w:tcW w:w="2200" w:type="dxa"/>
+            <w:shd w:val="clear" w:color="auto" w:fill="FFE8E1"/>
+            <w:vAlign w:val="center"/>
+          </w:tcPr>
+          <w:p>
+            <w:pPr>
+              <w:spacing w:after="0" w:line="240" w:lineRule="auto"/>
+              <w:jc w:val="center"/>
+              <w:rPr>
+                <w:b/>
+                <w:sz w:val="18"/>
+                <w:szCs w:val="18"/>
+              </w:rPr>
+            </w:pPr>
+            <w:r>
+              <w:rPr>
+                <w:b/>
+                <w:sz w:val="18"/>
+                <w:szCs w:val="18"/>
+              </w:rPr>
+              <w:t xml:space="preserve">Placement</w:t>
+            </w:r>
+          </w:p>
+        </w:tc>
+        <w:tc>
+          <w:tcPr>
+            <w:tcW w:w="4550" w:type="dxa"/>
+            <w:shd w:val="clear" w:color="auto" w:fill="FFE8E1"/>
+            <w:vAlign w:val="center"/>
+          </w:tcPr>
+          <w:p>
+            <w:pPr>
+              <w:spacing w:after="0" w:line="240" w:lineRule="auto"/>
+              <w:jc w:val="center"/>
+              <w:rPr>
+                <w:b/>
+                <w:sz w:val="18"/>
+                <w:szCs w:val="18"/>
+              </w:rPr>
+            </w:pPr>
+            <w:r>
+              <w:rPr>
+                <w:b/>
+                <w:sz w:val="18"/>
+                <w:szCs w:val="18"/>
+              </w:rPr>
+              <w:t xml:space="preserve">Rationale</w:t>
+            </w:r>
+          </w:p>
+        </w:tc>
+      </w:tr>
+      <w:tr>
+        <w:tc>
+          <w:tcPr>
+            <w:tcW w:w="2600" w:type="dxa"/>
+            <w:vAlign w:val="center"/>
+          </w:tcPr>
+          <w:p>
+            <w:pPr>
+              <w:spacing w:after="0" w:line="240" w:lineRule="auto"/>
+              <w:rPr>
+                <w:sz w:val="18"/>
+                <w:szCs w:val="18"/>
+              </w:rPr>
+            </w:pPr>
+            <w:r>
+              <w:rPr>
+                <w:sz w:val="18"/>
+                <w:szCs w:val="18"/>
+              </w:rPr>
+              <w:t xml:space="preserve">13 Spring + Go services (incl. workflow-service)</w:t>
+            </w:r>
+          </w:p>
+        </w:tc>
+        <w:tc>
+          <w:tcPr>
+            <w:tcW w:w="2200" w:type="dxa"/>
+            <w:vAlign w:val="center"/>
+          </w:tcPr>
+          <w:p>
+            <w:pPr>
+              <w:spacing w:after="0" w:line="240" w:lineRule="auto"/>
+              <w:rPr>
+                <w:sz w:val="18"/>
+                <w:szCs w:val="18"/>
+              </w:rPr>
+            </w:pPr>
+            <w:r>
+              <w:rPr>
+                <w:sz w:val="18"/>
+                <w:szCs w:val="18"/>
+              </w:rPr>
+              <w:t xml:space="preserve">GKE</w:t>
+            </w:r>
+          </w:p>
+        </w:tc>
+        <w:tc>
+          <w:tcPr>
+            <w:tcW w:w="4550" w:type="dxa"/>
+            <w:vAlign w:val="center"/>
+          </w:tcPr>
+          <w:p>
+            <w:pPr>
+              <w:spacing w:after="0" w:line="240" w:lineRule="auto"/>
+              <w:rPr>
+                <w:sz w:val="18"/>
+                <w:szCs w:val="18"/>
+              </w:rPr>
+            </w:pPr>
+            <w:r>
+              <w:rPr>
+                <w:sz w:val="18"/>
+                <w:szCs w:val="18"/>
+              </w:rPr>
+              <w:t xml:space="preserve">Stateless, horizontally scalable — the natural fit for Kubernetes.</w:t>
+            </w:r>
+          </w:p>
+        </w:tc>
+      </w:tr>
+      <w:tr>
+        <w:tc>
+          <w:tcPr>
+            <w:tcW w:w="2600" w:type="dxa"/>
+            <w:vAlign w:val="center"/>
+          </w:tcPr>
+          <w:p>
+            <w:pPr>
+              <w:spacing w:after="0" w:line="240" w:lineRule="auto"/>
+              <w:rPr>
+                <w:sz w:val="18"/>
+                <w:szCs w:val="18"/>
+              </w:rPr>
+            </w:pPr>
+            <w:r>
+              <w:rPr>
+                <w:sz w:val="18"/>
+                <w:szCs w:val="18"/>
+              </w:rPr>
+              <w:t xml:space="preserve">Alloy agent</w:t>
+            </w:r>
+          </w:p>
+        </w:tc>
+        <w:tc>
+          <w:tcPr>
+            <w:tcW w:w="2200" w:type="dxa"/>
+            <w:vAlign w:val="center"/>
+          </w:tcPr>
+          <w:p>
+            <w:pPr>
+              <w:spacing w:after="0" w:line="240" w:lineRule="auto"/>
+              <w:rPr>
+                <w:sz w:val="18"/>
+                <w:szCs w:val="18"/>
+              </w:rPr>
+            </w:pPr>
+            <w:r>
+              <w:rPr>
+                <w:sz w:val="18"/>
+                <w:szCs w:val="18"/>
+              </w:rPr>
+              <w:t xml:space="preserve">GKE (DaemonSet)</w:t>
+            </w:r>
+          </w:p>
+        </w:tc>
+        <w:tc>
+          <w:tcPr>
+            <w:tcW w:w="4550" w:type="dxa"/>
+            <w:vAlign w:val="center"/>
+          </w:tcPr>
+          <w:p>
+            <w:pPr>
+              <w:spacing w:after="0" w:line="240" w:lineRule="auto"/>
+              <w:rPr>
+                <w:sz w:val="18"/>
+                <w:szCs w:val="18"/>
+              </w:rPr>
+            </w:pPr>
+            <w:r>
+              <w:rPr>
+                <w:sz w:val="18"/>
+                <w:szCs w:val="18"/>
+              </w:rPr>
+              <w:t xml:space="preserve">Collects metrics + logs at source, ships to the Obs VM.</w:t>
+            </w:r>
+          </w:p>
+        </w:tc>
+      </w:tr>
+      <w:tr>
+        <w:tc>
+          <w:tcPr>
+            <w:tcW w:w="2600" w:type="dxa"/>
+            <w:vAlign w:val="center"/>
+          </w:tcPr>
+          <w:p>
+            <w:pPr>
+              <w:spacing w:after="0" w:line="240" w:lineRule="auto"/>
+              <w:rPr>
+                <w:sz w:val="18"/>
+                <w:szCs w:val="18"/>
+              </w:rPr>
+            </w:pPr>
+            <w:r>
+              <w:rPr>
+                <w:sz w:val="18"/>
+                <w:szCs w:val="18"/>
+              </w:rPr>
+              <w:t xml:space="preserve">Frontend SPA</w:t>
+            </w:r>
+          </w:p>
+        </w:tc>
+        <w:tc>
+          <w:tcPr>
+            <w:tcW w:w="2200" w:type="dxa"/>
+            <w:vAlign w:val="center"/>
+          </w:tcPr>
+          <w:p>
+            <w:pPr>
+              <w:spacing w:after="0" w:line="240" w:lineRule="auto"/>
+              <w:rPr>
+                <w:sz w:val="18"/>
+                <w:szCs w:val="18"/>
+              </w:rPr>
+            </w:pPr>
+            <w:r>
+              <w:rPr>
+                <w:sz w:val="18"/>
+                <w:szCs w:val="18"/>
+              </w:rPr>
+              <w:t xml:space="preserve">Cloud Storage + CDN</w:t>
+            </w:r>
+          </w:p>
+        </w:tc>
+        <w:tc>
+          <w:tcPr>
+            <w:tcW w:w="4550" w:type="dxa"/>
+            <w:vAlign w:val="center"/>
+          </w:tcPr>
+          <w:p>
+            <w:pPr>
+              <w:spacing w:after="0" w:line="240" w:lineRule="auto"/>
+              <w:rPr>
+                <w:sz w:val="18"/>
+                <w:szCs w:val="18"/>
+              </w:rPr>
+            </w:pPr>
+            <w:r>
+              <w:rPr>
+                <w:sz w:val="18"/>
+                <w:szCs w:val="18"/>
+              </w:rPr>
+              <w:t xml:space="preserve">Static assets; no pod needed.</w:t>
+            </w:r>
+          </w:p>
+        </w:tc>
+      </w:tr>
+      <w:tr>
+        <w:tc>
+          <w:tcPr>
+            <w:tcW w:w="2600" w:type="dxa"/>
+            <w:vAlign w:val="center"/>
+          </w:tcPr>
+          <w:p>
+            <w:pPr>
+              <w:spacing w:after="0" w:line="240" w:lineRule="auto"/>
+              <w:rPr>
+                <w:sz w:val="18"/>
+                <w:szCs w:val="18"/>
+              </w:rPr>
+            </w:pPr>
+            <w:r>
+              <w:rPr>
+                <w:sz w:val="18"/>
+                <w:szCs w:val="18"/>
+              </w:rPr>
+              <w:t xml:space="preserve">Postgres+pgvector, RabbitMQ, Redis, MinIO</w:t>
+            </w:r>
+          </w:p>
+        </w:tc>
+        <w:tc>
+          <w:tcPr>
+            <w:tcW w:w="2200" w:type="dxa"/>
+            <w:vAlign w:val="center"/>
+          </w:tcPr>
+          <w:p>
+            <w:pPr>
+              <w:spacing w:after="0" w:line="240" w:lineRule="auto"/>
+              <w:rPr>
+                <w:sz w:val="18"/>
+                <w:szCs w:val="18"/>
+              </w:rPr>
+            </w:pPr>
+            <w:r>
+              <w:rPr>
+                <w:sz w:val="18"/>
+                <w:szCs w:val="18"/>
+              </w:rPr>
+              <w:t xml:space="preserve">Data VM</w:t>
+            </w:r>
+          </w:p>
+        </w:tc>
+        <w:tc>
+          <w:tcPr>
+            <w:tcW w:w="4550" w:type="dxa"/>
+            <w:vAlign w:val="center"/>
+          </w:tcPr>
+          <w:p>
+            <w:pPr>
+              <w:spacing w:after="0" w:line="240" w:lineRule="auto"/>
+              <w:rPr>
+                <w:sz w:val="18"/>
+                <w:szCs w:val="18"/>
+              </w:rPr>
+            </w:pPr>
+            <w:r>
+              <w:rPr>
+                <w:sz w:val="18"/>
+                <w:szCs w:val="18"/>
+              </w:rPr>
+              <w:t xml:space="preserve">Stateful — avoid DB-on-Kubernetes operator complexity; stable disk/IO, easy backup.</w:t>
+            </w:r>
+          </w:p>
+        </w:tc>
+      </w:tr>
+      <w:tr>
+        <w:tc>
+          <w:tcPr>
+            <w:tcW w:w="2600" w:type="dxa"/>
+            <w:vAlign w:val="center"/>
+          </w:tcPr>
+          <w:p>
+            <w:pPr>
+              <w:spacing w:after="0" w:line="240" w:lineRule="auto"/>
+              <w:rPr>
+                <w:sz w:val="18"/>
+                <w:szCs w:val="18"/>
+              </w:rPr>
+            </w:pPr>
+            <w:r>
+              <w:rPr>
+                <w:sz w:val="18"/>
+                <w:szCs w:val="18"/>
+              </w:rPr>
+              <w:t xml:space="preserve">Camunda 8 + Elasticsearch</w:t>
+            </w:r>
+          </w:p>
+        </w:tc>
+        <w:tc>
+          <w:tcPr>
+            <w:tcW w:w="2200" w:type="dxa"/>
+            <w:vAlign w:val="center"/>
+          </w:tcPr>
+          <w:p>
+            <w:pPr>
+              <w:spacing w:after="0" w:line="240" w:lineRule="auto"/>
+              <w:rPr>
+                <w:sz w:val="18"/>
+                <w:szCs w:val="18"/>
+              </w:rPr>
+            </w:pPr>
+            <w:r>
+              <w:rPr>
+                <w:sz w:val="18"/>
+                <w:szCs w:val="18"/>
+              </w:rPr>
+              <w:t xml:space="preserve">Data VM</w:t>
+            </w:r>
+          </w:p>
+        </w:tc>
+        <w:tc>
+          <w:tcPr>
+            <w:tcW w:w="4550" w:type="dxa"/>
+            <w:vAlign w:val="center"/>
+          </w:tcPr>
+          <w:p>
+            <w:pPr>
+              <w:spacing w:after="0" w:line="240" w:lineRule="auto"/>
+              <w:rPr>
+                <w:sz w:val="18"/>
+                <w:szCs w:val="18"/>
+              </w:rPr>
+            </w:pPr>
+            <w:r>
+              <w:rPr>
+                <w:sz w:val="18"/>
+                <w:szCs w:val="18"/>
+              </w:rPr>
+              <w:t xml:space="preserve">Heavy JVM + ES; isolated so it cannot starve the app pods.</w:t>
+            </w:r>
+          </w:p>
+        </w:tc>
+      </w:tr>
+      <w:tr>
+        <w:tc>
+          <w:tcPr>
+            <w:tcW w:w="2600" w:type="dxa"/>
+            <w:vAlign w:val="center"/>
+          </w:tcPr>
+          <w:p>
+            <w:pPr>
+              <w:spacing w:after="0" w:line="240" w:lineRule="auto"/>
+              <w:rPr>
+                <w:sz w:val="18"/>
+                <w:szCs w:val="18"/>
+              </w:rPr>
+            </w:pPr>
+            <w:r>
+              <w:rPr>
+                <w:sz w:val="18"/>
+                <w:szCs w:val="18"/>
+              </w:rPr>
+              <w:t xml:space="preserve">LGTM (Grafana, Prometheus, Loki, Tempo, Alloy gateway)</w:t>
+            </w:r>
+          </w:p>
+        </w:tc>
+        <w:tc>
+          <w:tcPr>
+            <w:tcW w:w="2200" w:type="dxa"/>
+            <w:vAlign w:val="center"/>
+          </w:tcPr>
+          <w:p>
+            <w:pPr>
+              <w:spacing w:after="0" w:line="240" w:lineRule="auto"/>
+              <w:rPr>
+                <w:sz w:val="18"/>
+                <w:szCs w:val="18"/>
+              </w:rPr>
+            </w:pPr>
+            <w:r>
+              <w:rPr>
+                <w:sz w:val="18"/>
+                <w:szCs w:val="18"/>
+              </w:rPr>
+              <w:t xml:space="preserve">Observability VM</w:t>
+            </w:r>
+          </w:p>
+        </w:tc>
+        <w:tc>
+          <w:tcPr>
+            <w:tcW w:w="4550" w:type="dxa"/>
+            <w:vAlign w:val="center"/>
+          </w:tcPr>
+          <w:p>
+            <w:pPr>
+              <w:spacing w:after="0" w:line="240" w:lineRule="auto"/>
+              <w:rPr>
+                <w:sz w:val="18"/>
+                <w:szCs w:val="18"/>
+              </w:rPr>
+            </w:pPr>
+            <w:r>
+              <w:rPr>
+                <w:sz w:val="18"/>
+                <w:szCs w:val="18"/>
+              </w:rPr>
+              <w:t xml:space="preserve">Monitoring must live outside the cluster it watches (SRE isolation).</w:t>
+            </w:r>
+          </w:p>
+        </w:tc>
+      </w:tr>
+    </w:tbl>
+    <w:p/>
+    <w:p>
+      <w:pPr>
+        <w:pStyle w:val="Heading3"/>
+      </w:pPr>
+      <w:bookmarkStart w:id="33" w:name="_Toc_pcms_obs"/>
+      <w:r>
+        <w:t xml:space="preserve">4.3 Observability</w:t>
+      </w:r>
+      <w:bookmarkEnd w:id="33"/>
+    </w:p>
+    <w:p>
+      <w:pPr>
+        <w:jc w:val="both"/>
+      </w:pPr>
+      <w:r>
+        <w:t xml:space="preserve">Observability uses a self-hosted Grafana LGTM stack on the dedicated VM. The application is instrumented vendor-neutrally — Micrometer Prometheus metrics, OTLP traces and structured logs — so the services run unchanged whether telemetry goes to self-hosted LGTM (GKE demo) or the docker-compose LGTM used in local dev. Configs and dashboards live under k8s/infra-vm/observability/.</w:t>
+      </w:r>
+    </w:p>
+    <w:p>
+      <w:pPr>
+        <w:jc w:val="left"/>
+        <w:rPr>
+          <w:b/>
+        </w:rPr>
+      </w:pPr>
+      <w:r>
+        <w:rPr>
+          <w:b/>
+          <w:bCs/>
+        </w:rPr>
+        <w:t xml:space="preserve">Telemetry data flow:</w:t>
+      </w:r>
+    </w:p>
+    <w:p>
+      <w:pPr>
+        <w:ind w:left="360"/>
+        <w:jc w:val="both"/>
+      </w:pPr>
+      <w:r>
+        <w:rPr>
+          <w:b/>
+        </w:rPr>
+        <w:t xml:space="preserve">• Metrics</w:t>
+      </w:r>
+      <w:r>
+        <w:t xml:space="preserve"> – the in-cluster Alloy DaemonSet scrapes each pod's /actuator/prometheus and remote-writes to Prometheus on the Obs VM (services are not scraped directly across the network).</w:t>
+      </w:r>
+    </w:p>
+    <w:p>
+      <w:pPr>
+        <w:ind w:left="360"/>
+        <w:jc w:val="both"/>
+      </w:pPr>
+      <w:r>
+        <w:rPr>
+          <w:b/>
+        </w:rPr>
+        <w:t xml:space="preserve">• Logs</w:t>
+      </w:r>
+      <w:r>
+        <w:t xml:space="preserve"> – Alloy tails pod logs and pushes to Loki, labelled by application / namespace / pod.</w:t>
+      </w:r>
+    </w:p>
+    <w:p>
+      <w:pPr>
+        <w:ind w:left="360"/>
+        <w:jc w:val="both"/>
+      </w:pPr>
+      <w:r>
+        <w:rPr>
+          <w:b/>
+        </w:rPr>
+        <w:t xml:space="preserve">• Traces</w:t>
+      </w:r>
+      <w:r>
+        <w:t xml:space="preserve"> – services send OTLP directly to the Alloy gateway on the Obs VM, which batches and forwards to Tempo.</w:t>
+      </w:r>
+    </w:p>
+    <w:p>
+      <w:pPr>
+        <w:ind w:left="360"/>
+        <w:jc w:val="both"/>
+      </w:pPr>
+      <w:r>
+        <w:rPr>
+          <w:b/>
+        </w:rPr>
+        <w:t xml:space="preserve">• Grafana</w:t>
+      </w:r>
+      <w:r>
+        <w:t xml:space="preserve"> – single pane over Prometheus + Loki + Tempo, with log-to-trace correlation (click a log's traceId to open the trace).</w:t>
+      </w:r>
+    </w:p>
+    <w:p>
+      <w:pPr>
+        <w:jc w:val="both"/>
+      </w:pPr>
+      <w:r>
+        <w:t xml:space="preserve">Provisioned dashboards: JVM (Micrometer), Spring Boot statistics, PostgreSQL, Redis and a PetClinic logs dashboard.</w:t>
+      </w:r>
+    </w:p>
+    <w:p>
+      <w:pPr>
+        <w:jc w:val="both"/>
+      </w:pPr>
+      <w:r>
+        <w:t xml:space="preserve">Storage note: Loki chunks and Tempo trace blocks can use the Data-VM MinIO as their S3 backend, so a single MinIO serves both application media and observability storage.</w:t>
+      </w:r>
+    </w:p>
+    <w:p>
+      <w:pPr>
+        <w:pStyle w:val="Heading3"/>
+      </w:pPr>
+      <w:bookmarkStart w:id="34" w:name="_Toc_pcms_cloud"/>
+      <w:r>
+        <w:t xml:space="preserve">4.4 Cloud Platform Notes (free-trial)</w:t>
+      </w:r>
+      <w:bookmarkEnd w:id="34"/>
+    </w:p>
+    <w:p>
+      <w:pPr>
+        <w:ind w:left="360"/>
+        <w:jc w:val="both"/>
+      </w:pPr>
+      <w:r>
+        <w:rPr>
+          <w:b/>
+        </w:rPr>
+        <w:t xml:space="preserve">• Quota</w:t>
+      </w:r>
+      <w:r>
+        <w:t xml:space="preserve"> – the free trial does not allow quota increases; upgrade to a paid billing account early (the $300 credit still applies) to raise the vCPU quota before sizing the cluster.</w:t>
+      </w:r>
+    </w:p>
+    <w:p>
+      <w:pPr>
+        <w:ind w:left="360"/>
+        <w:jc w:val="both"/>
+      </w:pPr>
+      <w:r>
+        <w:rPr>
+          <w:b/>
+        </w:rPr>
+        <w:t xml:space="preserve">• LLM</w:t>
+      </w:r>
+      <w:r>
+        <w:t xml:space="preserve"> – the credit cannot be spent on partner GenAI model-as-a-service, so genai-service keeps an external OpenRouter / OpenAI provider.</w:t>
+      </w:r>
+    </w:p>
+    <w:p>
+      <w:pPr>
+        <w:ind w:left="360"/>
+        <w:jc w:val="both"/>
+      </w:pPr>
+      <w:r>
+        <w:rPr>
+          <w:b/>
+        </w:rPr>
+        <w:t xml:space="preserve">• Lifecycle</w:t>
+      </w:r>
+      <w:r>
+        <w:t xml:space="preserve"> – the environment is brought up for the demo week and torn down afterwards (kubectl delete -k, docker compose down, delete cluster + VMs).</w:t>
       </w:r>
     </w:p>
     <w:sectPr>

</xml_diff>

<commit_message>
docs(diagrams): real provider/storage icons on both diagrams
- LLM Provider -> OpenRouter, SMTP -> Gmail, Bank -> bank, Camunda -> Camunda,
  MinIO -> MinIO logo (fetched from simpleicons/iconify, rasterized via sharp)
- fix: use ABSOLUTE icon paths (relative paths render blank in graphviz on Windows)
- re-embed Figure 1-1 + 4-1 into SDD (fix Fig 4-1 aspect)
- gitignore the local drawio-skill (not vendored)

Co-Authored-By: Claude Opus 4.8 <noreply@anthropic.com>
</commit_message>
<xml_diff>
--- a/docs/SDD_PCMS_v1.0.docx
+++ b/docs/SDD_PCMS_v1.0.docx
@@ -13697,7 +13697,7 @@
       <w:r>
         <w:drawing>
           <wp:inline distT="0" distB="0" distL="0" distR="0">
-            <wp:extent cx="5943600" cy="4343169"/>
+            <wp:extent cx="5943600" cy="3683572"/>
             <wp:effectExtent l="0" t="0" r="0" b="0"/>
             <wp:docPr id="102" name="Figure 4-1: PCMS GKE Deployment Architecture"/>
             <wp:cNvGraphicFramePr>
@@ -13719,7 +13719,7 @@
                   <pic:spPr>
                     <a:xfrm>
                       <a:off x="0" y="0"/>
-                      <a:ext cx="5943600" cy="4343169"/>
+                      <a:ext cx="5943600" cy="3683572"/>
                     </a:xfrm>
                     <a:prstGeom prst="rect">
                       <a:avLst/>

</xml_diff>